<commit_message>
feat: update empty row edge probe to include styles for better Word compatibility
</commit_message>
<xml_diff>
--- a/test-files/issue-157-empty-row-edge.docx
+++ b/test-files/issue-157-empty-row-edge.docx
@@ -7,7 +7,7 @@
         <w:rPr>
           <w:b/>
         </w:rPr>
-        <w:t xml:space="preserve">Control: two rows, one shared edge between them.</w:t>
+        <w:t xml:space="preserve">1. Control: two rows, one shared edge between them.</w:t>
       </w:r>
     </w:p>
     <w:tbl>
@@ -57,7 +57,7 @@
         <w:rPr>
           <w:b/>
         </w:rPr>
-        <w:t xml:space="preserve">The same, with an empty w:tr element between the two rows.</w:t>
+        <w:t xml:space="preserve">2. The same, with a row of exactly zero height between them.</w:t>
       </w:r>
     </w:p>
     <w:tbl>
@@ -88,7 +88,17 @@
           </w:p>
         </w:tc>
       </w:tr>
-      <w:tr/>
+      <w:tr>
+        <w:trPr>
+          <w:trHeight w:val="0" w:hRule="exact"/>
+        </w:trPr>
+        <w:tc>
+          <w:tcPr>
+            <w:shd w:val="clear" w:color="auto" w:fill="FFF2CC"/>
+          </w:tcPr>
+          <w:p/>
+        </w:tc>
+      </w:tr>
       <w:tr>
         <w:tc>
           <w:tcPr>
@@ -102,12 +112,73 @@
         </w:tc>
       </w:tr>
     </w:tbl>
-    <w:p>
-      <w:r>
-        <w:rPr>
-          <w:b/>
-        </w:rPr>
-        <w:t xml:space="preserve">Compare the thickness of the middle line in each.</w:t>
+    <w:p/>
+    <w:p>
+      <w:r>
+        <w:rPr>
+          <w:b/>
+        </w:rPr>
+        <w:t xml:space="preserve">3. The same, with a 2pt row between them - shorter than its own borders.</w:t>
+      </w:r>
+    </w:p>
+    <w:tbl>
+      <w:tblPr>
+        <w:tblW w:w="4000" w:type="dxa"/>
+        <w:tblLayout w:type="fixed"/>
+        <w:tblBorders>
+          <w:top w:val="single" w:sz="24" w:space="0" w:color="000000"/>
+          <w:bottom w:val="single" w:sz="24" w:space="0" w:color="000000"/>
+          <w:left w:val="nil"/>
+          <w:right w:val="nil"/>
+          <w:insideH w:val="single" w:sz="24" w:space="0" w:color="000000"/>
+          <w:insideV w:val="nil"/>
+        </w:tblBorders>
+      </w:tblPr>
+      <w:tblGrid>
+        <w:gridCol w:w="4000"/>
+      </w:tblGrid>
+      <w:tr>
+        <w:tc>
+          <w:tcPr>
+            <w:shd w:val="clear" w:color="auto" w:fill="D9EAD3"/>
+          </w:tcPr>
+          <w:p>
+            <w:r>
+              <w:t xml:space="preserve">upper</w:t>
+            </w:r>
+          </w:p>
+        </w:tc>
+      </w:tr>
+      <w:tr>
+        <w:trPr>
+          <w:trHeight w:val="40" w:hRule="exact"/>
+        </w:trPr>
+        <w:tc>
+          <w:tcPr>
+            <w:shd w:val="clear" w:color="auto" w:fill="FFF2CC"/>
+          </w:tcPr>
+          <w:p/>
+        </w:tc>
+      </w:tr>
+      <w:tr>
+        <w:tc>
+          <w:tcPr>
+            <w:shd w:val="clear" w:color="auto" w:fill="CFE2F3"/>
+          </w:tcPr>
+          <w:p>
+            <w:r>
+              <w:t xml:space="preserve">lower</w:t>
+            </w:r>
+          </w:p>
+        </w:tc>
+      </w:tr>
+    </w:tbl>
+    <w:p>
+      <w:r>
+        <w:rPr>
+          <w:b/>
+        </w:rPr>
+        <w:t xml:space="preserve">Measure the black band at each middle boundary against table 1's 3pt.</w:t>
       </w:r>
     </w:p>
     <w:sectPr>
@@ -116,4 +187,28 @@
     </w:sectPr>
   </w:body>
 </w:document>
+</file>
+
+<file path=word/styles.xml><?xml version="1.0" encoding="utf-8"?>
+<w:styles xmlns:w="http://schemas.openxmlformats.org/wordprocessingml/2006/main">
+  <w:docDefaults>
+    <w:rPrDefault>
+      <w:rPr>
+        <w:rFonts w:ascii="Times New Roman" w:hAnsi="Times New Roman" w:eastAsia="Times New Roman" w:cs="Times New Roman"/>
+        <w:kern w:val="2"/>
+        <w:sz w:val="20"/>
+        <w:szCs w:val="20"/>
+      </w:rPr>
+    </w:rPrDefault>
+    <w:pPrDefault>
+      <w:pPr>
+        <w:spacing w:before="0" w:after="0" w:line="240" w:lineRule="auto"/>
+      </w:pPr>
+    </w:pPrDefault>
+  </w:docDefaults>
+  <w:style w:type="paragraph" w:default="1" w:styleId="Normal">
+    <w:name w:val="Normal"/>
+    <w:qFormat/>
+  </w:style>
+</w:styles>
 </file>
</xml_diff>

<commit_message>
refactor: enhance documentation and clarify height measurement logic in issue 157 probes
</commit_message>
<xml_diff>
--- a/test-files/issue-157-empty-row-edge.docx
+++ b/test-files/issue-157-empty-row-edge.docx
@@ -173,12 +173,73 @@
         </w:tc>
       </w:tr>
     </w:tbl>
-    <w:p>
-      <w:r>
-        <w:rPr>
-          <w:b/>
-        </w:rPr>
-        <w:t xml:space="preserve">Measure the black band at each middle boundary against table 1's 3pt.</w:t>
+    <w:p/>
+    <w:p>
+      <w:r>
+        <w:rPr>
+          <w:b/>
+        </w:rPr>
+        <w:t xml:space="preserve">4. The same, with a 40pt row - taller than its borders, so nothing is floored.</w:t>
+      </w:r>
+    </w:p>
+    <w:tbl>
+      <w:tblPr>
+        <w:tblW w:w="4000" w:type="dxa"/>
+        <w:tblLayout w:type="fixed"/>
+        <w:tblBorders>
+          <w:top w:val="single" w:sz="24" w:space="0" w:color="000000"/>
+          <w:bottom w:val="single" w:sz="24" w:space="0" w:color="000000"/>
+          <w:left w:val="nil"/>
+          <w:right w:val="nil"/>
+          <w:insideH w:val="single" w:sz="24" w:space="0" w:color="000000"/>
+          <w:insideV w:val="nil"/>
+        </w:tblBorders>
+      </w:tblPr>
+      <w:tblGrid>
+        <w:gridCol w:w="4000"/>
+      </w:tblGrid>
+      <w:tr>
+        <w:tc>
+          <w:tcPr>
+            <w:shd w:val="clear" w:color="auto" w:fill="D9EAD3"/>
+          </w:tcPr>
+          <w:p>
+            <w:r>
+              <w:t xml:space="preserve">upper</w:t>
+            </w:r>
+          </w:p>
+        </w:tc>
+      </w:tr>
+      <w:tr>
+        <w:trPr>
+          <w:trHeight w:val="800" w:hRule="exact"/>
+        </w:trPr>
+        <w:tc>
+          <w:tcPr>
+            <w:shd w:val="clear" w:color="auto" w:fill="FFF2CC"/>
+          </w:tcPr>
+          <w:p/>
+        </w:tc>
+      </w:tr>
+      <w:tr>
+        <w:tc>
+          <w:tcPr>
+            <w:shd w:val="clear" w:color="auto" w:fill="CFE2F3"/>
+          </w:tcPr>
+          <w:p>
+            <w:r>
+              <w:t xml:space="preserve">lower</w:t>
+            </w:r>
+          </w:p>
+        </w:tc>
+      </w:tr>
+    </w:tbl>
+    <w:p>
+      <w:r>
+        <w:rPr>
+          <w:b/>
+        </w:rPr>
+        <w:t xml:space="preserve">Measure table 4's yellow row: 40pt means trHeight is the content box, 34 means it includes the borders.</w:t>
       </w:r>
     </w:p>
     <w:sectPr>

</xml_diff>

<commit_message>
refactor: clarify row height measurement logic and enhance related tests for Word compatibility
</commit_message>
<xml_diff>
--- a/test-files/issue-157-empty-row-edge.docx
+++ b/test-files/issue-157-empty-row-edge.docx
@@ -234,12 +234,73 @@
         </w:tc>
       </w:tr>
     </w:tbl>
-    <w:p>
-      <w:r>
-        <w:rPr>
-          <w:b/>
-        </w:rPr>
-        <w:t xml:space="preserve">Measure table 4's yellow row: 40pt means trHeight is the content box, 34 means it includes the borders.</w:t>
+    <w:p/>
+    <w:p>
+      <w:r>
+        <w:rPr>
+          <w:b/>
+        </w:rPr>
+        <w:t xml:space="preserve">5. The same 40pt, declared atLeast rather than exact.</w:t>
+      </w:r>
+    </w:p>
+    <w:tbl>
+      <w:tblPr>
+        <w:tblW w:w="4000" w:type="dxa"/>
+        <w:tblLayout w:type="fixed"/>
+        <w:tblBorders>
+          <w:top w:val="single" w:sz="24" w:space="0" w:color="000000"/>
+          <w:bottom w:val="single" w:sz="24" w:space="0" w:color="000000"/>
+          <w:left w:val="nil"/>
+          <w:right w:val="nil"/>
+          <w:insideH w:val="single" w:sz="24" w:space="0" w:color="000000"/>
+          <w:insideV w:val="nil"/>
+        </w:tblBorders>
+      </w:tblPr>
+      <w:tblGrid>
+        <w:gridCol w:w="4000"/>
+      </w:tblGrid>
+      <w:tr>
+        <w:tc>
+          <w:tcPr>
+            <w:shd w:val="clear" w:color="auto" w:fill="D9EAD3"/>
+          </w:tcPr>
+          <w:p>
+            <w:r>
+              <w:t xml:space="preserve">upper</w:t>
+            </w:r>
+          </w:p>
+        </w:tc>
+      </w:tr>
+      <w:tr>
+        <w:trPr>
+          <w:trHeight w:val="800" w:hRule="atLeast"/>
+        </w:trPr>
+        <w:tc>
+          <w:tcPr>
+            <w:shd w:val="clear" w:color="auto" w:fill="FFF2CC"/>
+          </w:tcPr>
+          <w:p/>
+        </w:tc>
+      </w:tr>
+      <w:tr>
+        <w:tc>
+          <w:tcPr>
+            <w:shd w:val="clear" w:color="auto" w:fill="CFE2F3"/>
+          </w:tcPr>
+          <w:p>
+            <w:r>
+              <w:t xml:space="preserve">lower</w:t>
+            </w:r>
+          </w:p>
+        </w:tc>
+      </w:tr>
+    </w:tbl>
+    <w:p>
+      <w:r>
+        <w:rPr>
+          <w:b/>
+        </w:rPr>
+        <w:t xml:space="preserve">Measure the yellow rows of tables 4 and 5: 40pt means trHeight is the content box, 34 means it includes the borders.</w:t>
       </w:r>
     </w:p>
     <w:sectPr>

</xml_diff>